<commit_message>
update to midi spec
</commit_message>
<xml_diff>
--- a/docs/CVOCD Config MIDI Spec.docx
+++ b/docs/CVOCD Config MIDI Spec.docx
@@ -1,6 +1,6 @@
 
 <file path=word/document.xml><?xml version="1.0" encoding="utf-8"?>
-<w:document xmlns:wpc="http://schemas.microsoft.com/office/word/2010/wordprocessingCanvas" xmlns:cx="http://schemas.microsoft.com/office/drawing/2014/chartex" xmlns:cx1="http://schemas.microsoft.com/office/drawing/2015/9/8/chartex" xmlns:cx2="http://schemas.microsoft.com/office/drawing/2015/10/21/chartex" xmlns:cx3="http://schemas.microsoft.com/office/drawing/2016/5/9/chartex" xmlns:cx4="http://schemas.microsoft.com/office/drawing/2016/5/10/chartex" xmlns:cx5="http://schemas.microsoft.com/office/drawing/2016/5/11/chartex" xmlns:cx6="http://schemas.microsoft.com/office/drawing/2016/5/12/chartex" xmlns:cx7="http://schemas.microsoft.com/office/drawing/2016/5/13/chartex" xmlns:cx8="http://schemas.microsoft.com/office/drawing/2016/5/14/chartex" xmlns:mc="http://schemas.openxmlformats.org/markup-compatibility/2006" xmlns:aink="http://schemas.microsoft.com/office/drawing/2016/ink" xmlns:am3d="http://schemas.microsoft.com/office/drawing/2017/model3d" xmlns:o="urn:schemas-microsoft-com:office:office" xmlns:r="http://schemas.openxmlformats.org/officeDocument/2006/relationships" xmlns:m="http://schemas.openxmlformats.org/officeDocument/2006/math" xmlns:v="urn:schemas-microsoft-com:vml" xmlns:wp14="http://schemas.microsoft.com/office/word/2010/wordprocessingDrawing" xmlns:wp="http://schemas.openxmlformats.org/drawingml/2006/wordprocessingDrawing" xmlns:w10="urn:schemas-microsoft-com:office:word" xmlns:w="http://schemas.openxmlformats.org/wordprocessingml/2006/main" xmlns:w14="http://schemas.microsoft.com/office/word/2010/wordml" xmlns:w15="http://schemas.microsoft.com/office/word/2012/wordml" xmlns:w16cid="http://schemas.microsoft.com/office/word/2016/wordml/cid" xmlns:w16se="http://schemas.microsoft.com/office/word/2015/wordml/symex" xmlns:wpg="http://schemas.microsoft.com/office/word/2010/wordprocessingGroup" xmlns:wpi="http://schemas.microsoft.com/office/word/2010/wordprocessingInk" xmlns:wne="http://schemas.microsoft.com/office/word/2006/wordml" xmlns:wps="http://schemas.microsoft.com/office/word/2010/wordprocessingShape" mc:Ignorable="w14 w15 w16se w16cid wp14">
+<w:document xmlns:wpc="http://schemas.microsoft.com/office/word/2010/wordprocessingCanvas" xmlns:cx="http://schemas.microsoft.com/office/drawing/2014/chartex" xmlns:cx1="http://schemas.microsoft.com/office/drawing/2015/9/8/chartex" xmlns:cx2="http://schemas.microsoft.com/office/drawing/2015/10/21/chartex" xmlns:cx3="http://schemas.microsoft.com/office/drawing/2016/5/9/chartex" xmlns:cx4="http://schemas.microsoft.com/office/drawing/2016/5/10/chartex" xmlns:cx5="http://schemas.microsoft.com/office/drawing/2016/5/11/chartex" xmlns:cx6="http://schemas.microsoft.com/office/drawing/2016/5/12/chartex" xmlns:cx7="http://schemas.microsoft.com/office/drawing/2016/5/13/chartex" xmlns:cx8="http://schemas.microsoft.com/office/drawing/2016/5/14/chartex" xmlns:mc="http://schemas.openxmlformats.org/markup-compatibility/2006" xmlns:aink="http://schemas.microsoft.com/office/drawing/2016/ink" xmlns:am3d="http://schemas.microsoft.com/office/drawing/2017/model3d" xmlns:o="urn:schemas-microsoft-com:office:office" xmlns:oel="http://schemas.microsoft.com/office/2019/extlst" xmlns:r="http://schemas.openxmlformats.org/officeDocument/2006/relationships" xmlns:m="http://schemas.openxmlformats.org/officeDocument/2006/math" xmlns:v="urn:schemas-microsoft-com:vml" xmlns:wp14="http://schemas.microsoft.com/office/word/2010/wordprocessingDrawing" xmlns:wp="http://schemas.openxmlformats.org/drawingml/2006/wordprocessingDrawing" xmlns:w10="urn:schemas-microsoft-com:office:word" xmlns:w="http://schemas.openxmlformats.org/wordprocessingml/2006/main" xmlns:w14="http://schemas.microsoft.com/office/word/2010/wordml" xmlns:w15="http://schemas.microsoft.com/office/word/2012/wordml" xmlns:w16cex="http://schemas.microsoft.com/office/word/2018/wordml/cex" xmlns:w16cid="http://schemas.microsoft.com/office/word/2016/wordml/cid" xmlns:w16="http://schemas.microsoft.com/office/word/2018/wordml" xmlns:w16du="http://schemas.microsoft.com/office/word/2023/wordml/word16du" xmlns:w16sdtdh="http://schemas.microsoft.com/office/word/2020/wordml/sdtdatahash" xmlns:w16sdtfl="http://schemas.microsoft.com/office/word/2024/wordml/sdtformatlock" xmlns:w16se="http://schemas.microsoft.com/office/word/2015/wordml/symex" xmlns:wpg="http://schemas.microsoft.com/office/word/2010/wordprocessingGroup" xmlns:wpi="http://schemas.microsoft.com/office/word/2010/wordprocessingInk" xmlns:wne="http://schemas.microsoft.com/office/word/2006/wordml" xmlns:wps="http://schemas.microsoft.com/office/word/2010/wordprocessingShape" mc:Ignorable="w14 w15 w16se w16cid w16 w16cex w16sdtdh w16sdtfl w16du wp14">
   <w:body>
     <w:p>
       <w:pPr>
@@ -58,15 +58,7 @@
     </w:p>
     <w:p>
       <w:r>
-        <w:t xml:space="preserve">These four bytes are “start of </w:t>
-      </w:r>
-      <w:proofErr w:type="spellStart"/>
-      <w:r>
-        <w:t>sysex</w:t>
-      </w:r>
-      <w:proofErr w:type="spellEnd"/>
-      <w:r>
-        <w:t>” marker followed by three bytes that identify this as a CVOCD configuration file.</w:t>
+        <w:t>These four bytes are “start of sysex” marker followed by three bytes that identify this as a CVOCD configuration file.</w:t>
       </w:r>
     </w:p>
     <w:p>
@@ -95,13 +87,7 @@
         </w:numPr>
       </w:pPr>
       <w:r>
-        <w:t xml:space="preserve">Parameter </w:t>
-      </w:r>
-      <w:r>
-        <w:t>L</w:t>
-      </w:r>
-      <w:r>
-        <w:t>SB</w:t>
+        <w:t>Parameter LSB</w:t>
       </w:r>
     </w:p>
     <w:p>
@@ -113,10 +99,7 @@
         </w:numPr>
       </w:pPr>
       <w:r>
-        <w:t>Value</w:t>
-      </w:r>
-      <w:r>
-        <w:t xml:space="preserve"> MSB</w:t>
+        <w:t>Value MSB</w:t>
       </w:r>
     </w:p>
     <w:p>
@@ -128,28 +111,12 @@
         </w:numPr>
       </w:pPr>
       <w:r>
-        <w:t xml:space="preserve">Value </w:t>
+        <w:t>Value LSB</w:t>
       </w:r>
-      <w:r>
-        <w:t>L</w:t>
-      </w:r>
-      <w:r>
-        <w:t>SB</w:t>
-      </w:r>
-      <w:bookmarkStart w:id="0" w:name="_GoBack"/>
-      <w:bookmarkEnd w:id="0"/>
     </w:p>
     <w:p>
       <w:r>
-        <w:t xml:space="preserve">The file is terminated by “end of </w:t>
-      </w:r>
-      <w:proofErr w:type="spellStart"/>
-      <w:r>
-        <w:t>sysex</w:t>
-      </w:r>
-      <w:proofErr w:type="spellEnd"/>
-      <w:r>
-        <w:t>” marker</w:t>
+        <w:t>The file is terminated by “end of sysex” marker</w:t>
       </w:r>
     </w:p>
     <w:p>
@@ -201,16 +168,7 @@
         </w:numPr>
       </w:pPr>
       <w:r>
-        <w:t xml:space="preserve">Parameter </w:t>
-      </w:r>
-      <w:r>
-        <w:t>L</w:t>
-      </w:r>
-      <w:r>
-        <w:t>SB delivered using MIDI Continuous Controller Message with controller number 9</w:t>
-      </w:r>
-      <w:r>
-        <w:t>8</w:t>
+        <w:t>Parameter LSB delivered using MIDI Continuous Controller Message with controller number 98</w:t>
       </w:r>
     </w:p>
     <w:p>
@@ -222,16 +180,7 @@
         </w:numPr>
       </w:pPr>
       <w:r>
-        <w:t xml:space="preserve">Data </w:t>
-      </w:r>
-      <w:r>
-        <w:t xml:space="preserve">MSB delivered using MIDI Continuous Controller Message with controller number </w:t>
-      </w:r>
-      <w:r>
-        <w:t>6</w:t>
-      </w:r>
-      <w:r>
-        <w:t xml:space="preserve"> </w:t>
+        <w:t xml:space="preserve">Data MSB delivered using MIDI Continuous Controller Message with controller number 6 </w:t>
       </w:r>
     </w:p>
     <w:p>
@@ -243,16 +192,7 @@
         </w:numPr>
       </w:pPr>
       <w:r>
-        <w:t xml:space="preserve">Data </w:t>
-      </w:r>
-      <w:r>
-        <w:t>L</w:t>
-      </w:r>
-      <w:r>
-        <w:t xml:space="preserve">SB delivered using MIDI Continuous Controller Message with controller number </w:t>
-      </w:r>
-      <w:r>
-        <w:t>38</w:t>
+        <w:t>Data LSB delivered using MIDI Continuous Controller Message with controller number 38</w:t>
       </w:r>
     </w:p>
     <w:p>
@@ -270,28 +210,12 @@
         <w:pStyle w:val="Heading2"/>
       </w:pPr>
       <w:r>
-        <w:t xml:space="preserve">Ordering </w:t>
-      </w:r>
-      <w:proofErr w:type="gramStart"/>
-      <w:r>
-        <w:t>Of</w:t>
-      </w:r>
-      <w:proofErr w:type="gramEnd"/>
-      <w:r>
-        <w:t xml:space="preserve"> Parameters</w:t>
+        <w:t>Ordering Of Parameters</w:t>
       </w:r>
     </w:p>
     <w:p>
       <w:r>
-        <w:t xml:space="preserve">Writing certain parameters (such as changing “Source” of a CV or Gate output) will result in default information being set for the remaining config of that output, so more specific config must be sent afterwards. In </w:t>
-      </w:r>
-      <w:proofErr w:type="gramStart"/>
-      <w:r>
-        <w:t>general</w:t>
-      </w:r>
-      <w:proofErr w:type="gramEnd"/>
-      <w:r>
-        <w:t xml:space="preserve"> send parameters in order they appear in the CVOCD config page and observe when a parameter is not relevant to a source setting (i.e. field in config page is disabled). Sending a not-relevant parameter might set an internal setting to an invalid value resulting in unwanted behaviour (validation is minimal due to lack of program memory)</w:t>
+        <w:t>Writing certain parameters (such as changing “Source” of a CV or Gate output) will result in default information being set for the remaining config of that output, so more specific config must be sent afterwards. In general send parameters in order they appear in the CVOCD config page and observe when a parameter is not relevant to a source setting (i.e. field in config page is disabled). Sending a not-relevant parameter might set an internal setting to an invalid value resulting in unwanted behaviour (validation is minimal due to lack of program memory)</w:t>
       </w:r>
     </w:p>
     <w:p/>
@@ -456,30 +380,14 @@
                 <w:sz w:val="18"/>
                 <w:szCs w:val="18"/>
               </w:rPr>
-              <w:t>(0</w:t>
-            </w:r>
-            <w:proofErr w:type="gramStart"/>
-            <w:r>
-              <w:rPr>
-                <w:sz w:val="18"/>
-                <w:szCs w:val="18"/>
-              </w:rPr>
-              <w:t>C)</w:t>
-            </w:r>
-            <w:r>
-              <w:rPr>
-                <w:sz w:val="18"/>
-                <w:szCs w:val="18"/>
-              </w:rPr>
-              <w:t>=</w:t>
-            </w:r>
-            <w:proofErr w:type="gramEnd"/>
-            <w:r>
-              <w:rPr>
-                <w:sz w:val="18"/>
-                <w:szCs w:val="18"/>
-              </w:rPr>
-              <w:t xml:space="preserve"> Note Input #2</w:t>
+              <w:t>(0C)</w:t>
+            </w:r>
+            <w:r>
+              <w:rPr>
+                <w:sz w:val="18"/>
+                <w:szCs w:val="18"/>
+              </w:rPr>
+              <w:t>= Note Input #2</w:t>
             </w:r>
           </w:p>
           <w:p>
@@ -501,30 +409,14 @@
                 <w:sz w:val="18"/>
                 <w:szCs w:val="18"/>
               </w:rPr>
-              <w:t>(0</w:t>
-            </w:r>
-            <w:proofErr w:type="gramStart"/>
-            <w:r>
-              <w:rPr>
-                <w:sz w:val="18"/>
-                <w:szCs w:val="18"/>
-              </w:rPr>
-              <w:t>D)</w:t>
-            </w:r>
-            <w:r>
-              <w:rPr>
-                <w:sz w:val="18"/>
-                <w:szCs w:val="18"/>
-              </w:rPr>
-              <w:t>=</w:t>
-            </w:r>
-            <w:proofErr w:type="gramEnd"/>
-            <w:r>
-              <w:rPr>
-                <w:sz w:val="18"/>
-                <w:szCs w:val="18"/>
-              </w:rPr>
-              <w:t xml:space="preserve"> Note Input #3</w:t>
+              <w:t>(0D)</w:t>
+            </w:r>
+            <w:r>
+              <w:rPr>
+                <w:sz w:val="18"/>
+                <w:szCs w:val="18"/>
+              </w:rPr>
+              <w:t>= Note Input #3</w:t>
             </w:r>
           </w:p>
           <w:p>
@@ -1115,6 +1007,13 @@
               </w:rPr>
               <w:t>9 = 2 Note Chord</w:t>
             </w:r>
+            <w:r>
+              <w:rPr>
+                <w:sz w:val="18"/>
+                <w:szCs w:val="18"/>
+              </w:rPr>
+              <w:t>*</w:t>
+            </w:r>
           </w:p>
           <w:p>
             <w:pPr>
@@ -1144,6 +1043,13 @@
               </w:rPr>
               <w:t xml:space="preserve"> = 3 Note Chord</w:t>
             </w:r>
+            <w:r>
+              <w:rPr>
+                <w:sz w:val="18"/>
+                <w:szCs w:val="18"/>
+              </w:rPr>
+              <w:t>*</w:t>
+            </w:r>
           </w:p>
           <w:p>
             <w:pPr>
@@ -1172,6 +1078,136 @@
                 <w:szCs w:val="18"/>
               </w:rPr>
               <w:t>= 4 Note Chord</w:t>
+            </w:r>
+            <w:r>
+              <w:rPr>
+                <w:sz w:val="18"/>
+                <w:szCs w:val="18"/>
+              </w:rPr>
+              <w:t>*</w:t>
+            </w:r>
+          </w:p>
+          <w:p>
+            <w:pPr>
+              <w:rPr>
+                <w:sz w:val="18"/>
+                <w:szCs w:val="18"/>
+              </w:rPr>
+            </w:pPr>
+            <w:r>
+              <w:rPr>
+                <w:sz w:val="18"/>
+                <w:szCs w:val="18"/>
+              </w:rPr>
+              <w:t>1</w:t>
+            </w:r>
+            <w:r>
+              <w:rPr>
+                <w:sz w:val="18"/>
+                <w:szCs w:val="18"/>
+              </w:rPr>
+              <w:t>2</w:t>
+            </w:r>
+            <w:r>
+              <w:rPr>
+                <w:sz w:val="18"/>
+                <w:szCs w:val="18"/>
+              </w:rPr>
+              <w:t xml:space="preserve">(0B) = </w:t>
+            </w:r>
+            <w:r>
+              <w:rPr>
+                <w:sz w:val="18"/>
+                <w:szCs w:val="18"/>
+              </w:rPr>
+              <w:t>Paraphonic</w:t>
+            </w:r>
+          </w:p>
+          <w:p>
+            <w:pPr>
+              <w:rPr>
+                <w:sz w:val="18"/>
+                <w:szCs w:val="18"/>
+              </w:rPr>
+            </w:pPr>
+            <w:r>
+              <w:rPr>
+                <w:sz w:val="18"/>
+                <w:szCs w:val="18"/>
+              </w:rPr>
+              <w:t>1</w:t>
+            </w:r>
+            <w:r>
+              <w:rPr>
+                <w:sz w:val="18"/>
+                <w:szCs w:val="18"/>
+              </w:rPr>
+              <w:t>3</w:t>
+            </w:r>
+            <w:r>
+              <w:rPr>
+                <w:sz w:val="18"/>
+                <w:szCs w:val="18"/>
+              </w:rPr>
+              <w:t xml:space="preserve">(0B) = </w:t>
+            </w:r>
+            <w:r>
+              <w:rPr>
+                <w:sz w:val="18"/>
+                <w:szCs w:val="18"/>
+              </w:rPr>
+              <w:t>Para. Release</w:t>
+            </w:r>
+          </w:p>
+          <w:p>
+            <w:pPr>
+              <w:rPr>
+                <w:sz w:val="18"/>
+                <w:szCs w:val="18"/>
+              </w:rPr>
+            </w:pPr>
+          </w:p>
+          <w:p>
+            <w:pPr>
+              <w:rPr>
+                <w:sz w:val="18"/>
+                <w:szCs w:val="18"/>
+              </w:rPr>
+            </w:pPr>
+            <w:r>
+              <w:rPr>
+                <w:sz w:val="18"/>
+                <w:szCs w:val="18"/>
+              </w:rPr>
+              <w:t xml:space="preserve">* from F/W </w:t>
+            </w:r>
+            <w:r>
+              <w:rPr>
+                <w:sz w:val="18"/>
+                <w:szCs w:val="18"/>
+              </w:rPr>
+              <w:t>R</w:t>
+            </w:r>
+            <w:r>
+              <w:rPr>
+                <w:sz w:val="18"/>
+                <w:szCs w:val="18"/>
+              </w:rPr>
+              <w:t>ev 5.3</w:t>
+            </w:r>
+            <w:r>
+              <w:rPr>
+                <w:sz w:val="18"/>
+                <w:szCs w:val="18"/>
+              </w:rPr>
+              <w:t>,</w:t>
+            </w:r>
+            <w:r>
+              <w:rPr>
+                <w:sz w:val="18"/>
+                <w:szCs w:val="18"/>
+              </w:rPr>
+              <w:t xml:space="preserve"> modes 9/10/11 are equivalent and simply Polyphonic mode</w:t>
             </w:r>
           </w:p>
         </w:tc>
@@ -2006,12 +2042,14 @@
           <w:p>
             <w:pPr>
               <w:rPr>
-                <w:sz w:val="18"/>
-                <w:szCs w:val="18"/>
-              </w:rPr>
-            </w:pPr>
-            <w:r>
-              <w:rPr>
+                <w:strike/>
+                <w:sz w:val="18"/>
+                <w:szCs w:val="18"/>
+              </w:rPr>
+            </w:pPr>
+            <w:r>
+              <w:rPr>
+                <w:strike/>
                 <w:sz w:val="18"/>
                 <w:szCs w:val="18"/>
               </w:rPr>
@@ -2019,6 +2057,7 @@
             </w:r>
             <w:r>
               <w:rPr>
+                <w:strike/>
                 <w:sz w:val="18"/>
                 <w:szCs w:val="18"/>
               </w:rPr>
@@ -2026,6 +2065,7 @@
             </w:r>
             <w:r>
               <w:rPr>
+                <w:strike/>
                 <w:sz w:val="18"/>
                 <w:szCs w:val="18"/>
               </w:rPr>
@@ -2035,25 +2075,28 @@
           <w:p>
             <w:pPr>
               <w:rPr>
-                <w:sz w:val="18"/>
-                <w:szCs w:val="18"/>
-              </w:rPr>
-            </w:pPr>
-          </w:p>
-        </w:tc>
-        <w:tc>
-          <w:tcPr>
-            <w:tcW w:w="1250" w:type="pct"/>
-          </w:tcPr>
-          <w:p>
-            <w:pPr>
-              <w:rPr>
-                <w:sz w:val="18"/>
-                <w:szCs w:val="18"/>
-              </w:rPr>
-            </w:pPr>
-            <w:r>
-              <w:rPr>
+                <w:strike/>
+                <w:sz w:val="18"/>
+                <w:szCs w:val="18"/>
+              </w:rPr>
+            </w:pPr>
+          </w:p>
+        </w:tc>
+        <w:tc>
+          <w:tcPr>
+            <w:tcW w:w="1250" w:type="pct"/>
+          </w:tcPr>
+          <w:p>
+            <w:pPr>
+              <w:rPr>
+                <w:strike/>
+                <w:sz w:val="18"/>
+                <w:szCs w:val="18"/>
+              </w:rPr>
+            </w:pPr>
+            <w:r>
+              <w:rPr>
+                <w:strike/>
                 <w:sz w:val="18"/>
                 <w:szCs w:val="18"/>
               </w:rPr>
@@ -2766,21 +2809,20 @@
                 <w:szCs w:val="18"/>
               </w:rPr>
             </w:pPr>
-            <w:proofErr w:type="gramStart"/>
-            <w:r>
-              <w:rPr>
-                <w:sz w:val="18"/>
-                <w:szCs w:val="18"/>
-              </w:rPr>
-              <w:t>Correction  (</w:t>
-            </w:r>
-            <w:proofErr w:type="gramEnd"/>
-            <w:r>
-              <w:rPr>
-                <w:sz w:val="18"/>
-                <w:szCs w:val="18"/>
-              </w:rPr>
-              <w:t>0-127) mapped to -63 to +63 DAC units (2mV) over full 8 octave range</w:t>
+            <w:r>
+              <w:rPr>
+                <w:sz w:val="18"/>
+                <w:szCs w:val="18"/>
+              </w:rPr>
+              <w:t xml:space="preserve">Correction  (0-127) mapped to -63 to +63 DAC units </w:t>
+            </w:r>
+            <w:r>
+              <w:rPr>
+                <w:sz w:val="18"/>
+                <w:szCs w:val="18"/>
+              </w:rPr>
+              <w:lastRenderedPageBreak/>
+              <w:t>(2mV) over full 8 octave range</w:t>
             </w:r>
           </w:p>
         </w:tc>
@@ -2865,21 +2907,12 @@
                 <w:szCs w:val="18"/>
               </w:rPr>
             </w:pPr>
-            <w:proofErr w:type="gramStart"/>
-            <w:r>
-              <w:rPr>
-                <w:sz w:val="18"/>
-                <w:szCs w:val="18"/>
-              </w:rPr>
-              <w:t>Correction  (</w:t>
-            </w:r>
-            <w:proofErr w:type="gramEnd"/>
-            <w:r>
-              <w:rPr>
-                <w:sz w:val="18"/>
-                <w:szCs w:val="18"/>
-              </w:rPr>
-              <w:t xml:space="preserve">0-127) mapped to -63 to +63 DAC units (2mV) </w:t>
+            <w:r>
+              <w:rPr>
+                <w:sz w:val="18"/>
+                <w:szCs w:val="18"/>
+              </w:rPr>
+              <w:t xml:space="preserve">Correction  (0-127) mapped to -63 to +63 DAC units (2mV) </w:t>
             </w:r>
           </w:p>
         </w:tc>
@@ -2898,7 +2931,6 @@
         <w:pStyle w:val="Heading2"/>
       </w:pPr>
       <w:r>
-        <w:lastRenderedPageBreak/>
         <w:t>Gate Output</w:t>
       </w:r>
     </w:p>
@@ -5388,7 +5420,7 @@
 </file>
 
 <file path=word/numbering.xml><?xml version="1.0" encoding="utf-8"?>
-<w:numbering xmlns:wpc="http://schemas.microsoft.com/office/word/2010/wordprocessingCanvas" xmlns:cx="http://schemas.microsoft.com/office/drawing/2014/chartex" xmlns:cx1="http://schemas.microsoft.com/office/drawing/2015/9/8/chartex" xmlns:cx2="http://schemas.microsoft.com/office/drawing/2015/10/21/chartex" xmlns:cx3="http://schemas.microsoft.com/office/drawing/2016/5/9/chartex" xmlns:cx4="http://schemas.microsoft.com/office/drawing/2016/5/10/chartex" xmlns:cx5="http://schemas.microsoft.com/office/drawing/2016/5/11/chartex" xmlns:cx6="http://schemas.microsoft.com/office/drawing/2016/5/12/chartex" xmlns:cx7="http://schemas.microsoft.com/office/drawing/2016/5/13/chartex" xmlns:cx8="http://schemas.microsoft.com/office/drawing/2016/5/14/chartex" xmlns:mc="http://schemas.openxmlformats.org/markup-compatibility/2006" xmlns:aink="http://schemas.microsoft.com/office/drawing/2016/ink" xmlns:am3d="http://schemas.microsoft.com/office/drawing/2017/model3d" xmlns:o="urn:schemas-microsoft-com:office:office" xmlns:r="http://schemas.openxmlformats.org/officeDocument/2006/relationships" xmlns:m="http://schemas.openxmlformats.org/officeDocument/2006/math" xmlns:v="urn:schemas-microsoft-com:vml" xmlns:wp14="http://schemas.microsoft.com/office/word/2010/wordprocessingDrawing" xmlns:wp="http://schemas.openxmlformats.org/drawingml/2006/wordprocessingDrawing" xmlns:w10="urn:schemas-microsoft-com:office:word" xmlns:w="http://schemas.openxmlformats.org/wordprocessingml/2006/main" xmlns:w14="http://schemas.microsoft.com/office/word/2010/wordml" xmlns:w15="http://schemas.microsoft.com/office/word/2012/wordml" xmlns:w16cid="http://schemas.microsoft.com/office/word/2016/wordml/cid" xmlns:w16se="http://schemas.microsoft.com/office/word/2015/wordml/symex" xmlns:wpg="http://schemas.microsoft.com/office/word/2010/wordprocessingGroup" xmlns:wpi="http://schemas.microsoft.com/office/word/2010/wordprocessingInk" xmlns:wne="http://schemas.microsoft.com/office/word/2006/wordml" xmlns:wps="http://schemas.microsoft.com/office/word/2010/wordprocessingShape" mc:Ignorable="w14 w15 w16se w16cid wp14">
+<w:numbering xmlns:wpc="http://schemas.microsoft.com/office/word/2010/wordprocessingCanvas" xmlns:cx="http://schemas.microsoft.com/office/drawing/2014/chartex" xmlns:cx1="http://schemas.microsoft.com/office/drawing/2015/9/8/chartex" xmlns:cx2="http://schemas.microsoft.com/office/drawing/2015/10/21/chartex" xmlns:cx3="http://schemas.microsoft.com/office/drawing/2016/5/9/chartex" xmlns:cx4="http://schemas.microsoft.com/office/drawing/2016/5/10/chartex" xmlns:cx5="http://schemas.microsoft.com/office/drawing/2016/5/11/chartex" xmlns:cx6="http://schemas.microsoft.com/office/drawing/2016/5/12/chartex" xmlns:cx7="http://schemas.microsoft.com/office/drawing/2016/5/13/chartex" xmlns:cx8="http://schemas.microsoft.com/office/drawing/2016/5/14/chartex" xmlns:mc="http://schemas.openxmlformats.org/markup-compatibility/2006" xmlns:aink="http://schemas.microsoft.com/office/drawing/2016/ink" xmlns:am3d="http://schemas.microsoft.com/office/drawing/2017/model3d" xmlns:o="urn:schemas-microsoft-com:office:office" xmlns:oel="http://schemas.microsoft.com/office/2019/extlst" xmlns:r="http://schemas.openxmlformats.org/officeDocument/2006/relationships" xmlns:m="http://schemas.openxmlformats.org/officeDocument/2006/math" xmlns:v="urn:schemas-microsoft-com:vml" xmlns:wp14="http://schemas.microsoft.com/office/word/2010/wordprocessingDrawing" xmlns:wp="http://schemas.openxmlformats.org/drawingml/2006/wordprocessingDrawing" xmlns:w10="urn:schemas-microsoft-com:office:word" xmlns:w="http://schemas.openxmlformats.org/wordprocessingml/2006/main" xmlns:w14="http://schemas.microsoft.com/office/word/2010/wordml" xmlns:w15="http://schemas.microsoft.com/office/word/2012/wordml" xmlns:w16cex="http://schemas.microsoft.com/office/word/2018/wordml/cex" xmlns:w16cid="http://schemas.microsoft.com/office/word/2016/wordml/cid" xmlns:w16="http://schemas.microsoft.com/office/word/2018/wordml" xmlns:w16du="http://schemas.microsoft.com/office/word/2023/wordml/word16du" xmlns:w16sdtdh="http://schemas.microsoft.com/office/word/2020/wordml/sdtdatahash" xmlns:w16sdtfl="http://schemas.microsoft.com/office/word/2024/wordml/sdtformatlock" xmlns:w16se="http://schemas.microsoft.com/office/word/2015/wordml/symex" xmlns:wpg="http://schemas.microsoft.com/office/word/2010/wordprocessingGroup" xmlns:wpi="http://schemas.microsoft.com/office/word/2010/wordprocessingInk" xmlns:wne="http://schemas.microsoft.com/office/word/2006/wordml" xmlns:wps="http://schemas.microsoft.com/office/word/2010/wordprocessingShape" mc:Ignorable="w14 w15 w16se w16cid w16 w16cex w16sdtdh w16sdtfl w16du wp14">
   <w:abstractNum w:abstractNumId="0" w15:restartNumberingAfterBreak="0">
     <w:nsid w:val="5A6C1F00"/>
     <w:multiLevelType w:val="hybridMultilevel"/>
@@ -5615,17 +5647,17 @@
       </w:rPr>
     </w:lvl>
   </w:abstractNum>
-  <w:num w:numId="1">
+  <w:num w:numId="1" w16cid:durableId="114638265">
     <w:abstractNumId w:val="1"/>
   </w:num>
-  <w:num w:numId="2">
+  <w:num w:numId="2" w16cid:durableId="25567450">
     <w:abstractNumId w:val="0"/>
   </w:num>
 </w:numbering>
 </file>
 
 <file path=word/styles.xml><?xml version="1.0" encoding="utf-8"?>
-<w:styles xmlns:mc="http://schemas.openxmlformats.org/markup-compatibility/2006" xmlns:r="http://schemas.openxmlformats.org/officeDocument/2006/relationships" xmlns:w="http://schemas.openxmlformats.org/wordprocessingml/2006/main" xmlns:w14="http://schemas.microsoft.com/office/word/2010/wordml" xmlns:w15="http://schemas.microsoft.com/office/word/2012/wordml" xmlns:w16cid="http://schemas.microsoft.com/office/word/2016/wordml/cid" xmlns:w16se="http://schemas.microsoft.com/office/word/2015/wordml/symex" mc:Ignorable="w14 w15 w16se w16cid">
+<w:styles xmlns:mc="http://schemas.openxmlformats.org/markup-compatibility/2006" xmlns:r="http://schemas.openxmlformats.org/officeDocument/2006/relationships" xmlns:w="http://schemas.openxmlformats.org/wordprocessingml/2006/main" xmlns:w14="http://schemas.microsoft.com/office/word/2010/wordml" xmlns:w15="http://schemas.microsoft.com/office/word/2012/wordml" xmlns:w16cex="http://schemas.microsoft.com/office/word/2018/wordml/cex" xmlns:w16cid="http://schemas.microsoft.com/office/word/2016/wordml/cid" xmlns:w16="http://schemas.microsoft.com/office/word/2018/wordml" xmlns:w16du="http://schemas.microsoft.com/office/word/2023/wordml/word16du" xmlns:w16sdtdh="http://schemas.microsoft.com/office/word/2020/wordml/sdtdatahash" xmlns:w16sdtfl="http://schemas.microsoft.com/office/word/2024/wordml/sdtformatlock" xmlns:w16se="http://schemas.microsoft.com/office/word/2015/wordml/symex" mc:Ignorable="w14 w15 w16se w16cid w16 w16cex w16sdtdh w16sdtfl w16du">
   <w:docDefaults>
     <w:rPrDefault>
       <w:rPr>
@@ -5641,7 +5673,7 @@
       </w:pPr>
     </w:pPrDefault>
   </w:docDefaults>
-  <w:latentStyles w:defLockedState="0" w:defUIPriority="99" w:defSemiHidden="0" w:defUnhideWhenUsed="0" w:defQFormat="0" w:count="375">
+  <w:latentStyles w:defLockedState="0" w:defUIPriority="99" w:defSemiHidden="0" w:defUnhideWhenUsed="0" w:defQFormat="0" w:count="376">
     <w:lsdException w:name="Normal" w:uiPriority="0" w:qFormat="1"/>
     <w:lsdException w:name="heading 1" w:uiPriority="9" w:qFormat="1"/>
     <w:lsdException w:name="heading 2" w:semiHidden="1" w:uiPriority="9" w:unhideWhenUsed="1" w:qFormat="1"/>
@@ -6017,6 +6049,7 @@
     <w:lsdException w:name="Smart Hyperlink" w:semiHidden="1" w:unhideWhenUsed="1"/>
     <w:lsdException w:name="Hashtag" w:semiHidden="1" w:unhideWhenUsed="1"/>
     <w:lsdException w:name="Unresolved Mention" w:semiHidden="1" w:unhideWhenUsed="1"/>
+    <w:lsdException w:name="Smart Link" w:semiHidden="1" w:unhideWhenUsed="1"/>
   </w:latentStyles>
   <w:style w:type="paragraph" w:default="1" w:styleId="Normal">
     <w:name w:val="Normal"/>

</xml_diff>

<commit_message>
remove old MPLABX project
</commit_message>
<xml_diff>
--- a/docs/CVOCD Config MIDI Spec.docx
+++ b/docs/CVOCD Config MIDI Spec.docx
@@ -58,7 +58,15 @@
     </w:p>
     <w:p>
       <w:r>
-        <w:t>These four bytes are “start of sysex” marker followed by three bytes that identify this as a CVOCD configuration file.</w:t>
+        <w:t xml:space="preserve">These four bytes are “start of </w:t>
+      </w:r>
+      <w:proofErr w:type="spellStart"/>
+      <w:r>
+        <w:t>sysex</w:t>
+      </w:r>
+      <w:proofErr w:type="spellEnd"/>
+      <w:r>
+        <w:t>” marker followed by three bytes that identify this as a CVOCD configuration file.</w:t>
       </w:r>
     </w:p>
     <w:p>
@@ -116,7 +124,15 @@
     </w:p>
     <w:p>
       <w:r>
-        <w:t>The file is terminated by “end of sysex” marker</w:t>
+        <w:t xml:space="preserve">The file is terminated by “end of </w:t>
+      </w:r>
+      <w:proofErr w:type="spellStart"/>
+      <w:r>
+        <w:t>sysex</w:t>
+      </w:r>
+      <w:proofErr w:type="spellEnd"/>
+      <w:r>
+        <w:t>” marker</w:t>
       </w:r>
     </w:p>
     <w:p>
@@ -1115,6 +1131,7 @@
               </w:rPr>
               <w:t xml:space="preserve">(0B) = </w:t>
             </w:r>
+            <w:proofErr w:type="spellStart"/>
             <w:r>
               <w:rPr>
                 <w:sz w:val="18"/>
@@ -1122,6 +1139,7 @@
               </w:rPr>
               <w:t>Paraphonic</w:t>
             </w:r>
+            <w:proofErr w:type="spellEnd"/>
           </w:p>
           <w:p>
             <w:pPr>
@@ -1179,7 +1197,23 @@
                 <w:sz w:val="18"/>
                 <w:szCs w:val="18"/>
               </w:rPr>
-              <w:t xml:space="preserve">* from F/W </w:t>
+              <w:t xml:space="preserve">* </w:t>
+            </w:r>
+            <w:proofErr w:type="gramStart"/>
+            <w:r>
+              <w:rPr>
+                <w:sz w:val="18"/>
+                <w:szCs w:val="18"/>
+              </w:rPr>
+              <w:t>from</w:t>
+            </w:r>
+            <w:proofErr w:type="gramEnd"/>
+            <w:r>
+              <w:rPr>
+                <w:sz w:val="18"/>
+                <w:szCs w:val="18"/>
+              </w:rPr>
+              <w:t xml:space="preserve"> F/W </w:t>
             </w:r>
             <w:r>
               <w:rPr>
@@ -2042,32 +2076,48 @@
           <w:p>
             <w:pPr>
               <w:rPr>
-                <w:strike/>
-                <w:sz w:val="18"/>
-                <w:szCs w:val="18"/>
-              </w:rPr>
-            </w:pPr>
-            <w:r>
-              <w:rPr>
-                <w:strike/>
-                <w:sz w:val="18"/>
-                <w:szCs w:val="18"/>
-              </w:rPr>
-              <w:t>20</w:t>
-            </w:r>
-            <w:r>
-              <w:rPr>
-                <w:strike/>
-                <w:sz w:val="18"/>
-                <w:szCs w:val="18"/>
-              </w:rPr>
-              <w:t>(14)</w:t>
-            </w:r>
-            <w:r>
-              <w:rPr>
-                <w:strike/>
-                <w:sz w:val="18"/>
-                <w:szCs w:val="18"/>
+                <w:sz w:val="18"/>
+                <w:szCs w:val="18"/>
+                <w:highlight w:val="yellow"/>
+              </w:rPr>
+            </w:pPr>
+            <w:r>
+              <w:rPr>
+                <w:sz w:val="18"/>
+                <w:szCs w:val="18"/>
+                <w:highlight w:val="yellow"/>
+              </w:rPr>
+              <w:t xml:space="preserve">30 </w:t>
+            </w:r>
+            <w:r>
+              <w:rPr>
+                <w:sz w:val="18"/>
+                <w:szCs w:val="18"/>
+                <w:highlight w:val="yellow"/>
+              </w:rPr>
+              <w:t>(1</w:t>
+            </w:r>
+            <w:r>
+              <w:rPr>
+                <w:sz w:val="18"/>
+                <w:szCs w:val="18"/>
+                <w:highlight w:val="yellow"/>
+              </w:rPr>
+              <w:t>E</w:t>
+            </w:r>
+            <w:r>
+              <w:rPr>
+                <w:sz w:val="18"/>
+                <w:szCs w:val="18"/>
+                <w:highlight w:val="yellow"/>
+              </w:rPr>
+              <w:t>)</w:t>
+            </w:r>
+            <w:r>
+              <w:rPr>
+                <w:sz w:val="18"/>
+                <w:szCs w:val="18"/>
+                <w:highlight w:val="yellow"/>
               </w:rPr>
               <w:t xml:space="preserve"> – Scaled BPM</w:t>
             </w:r>
@@ -2075,30 +2125,30 @@
           <w:p>
             <w:pPr>
               <w:rPr>
-                <w:strike/>
-                <w:sz w:val="18"/>
-                <w:szCs w:val="18"/>
-              </w:rPr>
-            </w:pPr>
-          </w:p>
-        </w:tc>
-        <w:tc>
-          <w:tcPr>
-            <w:tcW w:w="1250" w:type="pct"/>
-          </w:tcPr>
-          <w:p>
-            <w:pPr>
-              <w:rPr>
-                <w:strike/>
-                <w:sz w:val="18"/>
-                <w:szCs w:val="18"/>
-              </w:rPr>
-            </w:pPr>
-            <w:r>
-              <w:rPr>
-                <w:strike/>
-                <w:sz w:val="18"/>
-                <w:szCs w:val="18"/>
+                <w:sz w:val="18"/>
+                <w:szCs w:val="18"/>
+                <w:highlight w:val="yellow"/>
+              </w:rPr>
+            </w:pPr>
+          </w:p>
+        </w:tc>
+        <w:tc>
+          <w:tcPr>
+            <w:tcW w:w="1250" w:type="pct"/>
+          </w:tcPr>
+          <w:p>
+            <w:pPr>
+              <w:rPr>
+                <w:sz w:val="18"/>
+                <w:szCs w:val="18"/>
+                <w:highlight w:val="yellow"/>
+              </w:rPr>
+            </w:pPr>
+            <w:r>
+              <w:rPr>
+                <w:sz w:val="18"/>
+                <w:szCs w:val="18"/>
+                <w:highlight w:val="yellow"/>
               </w:rPr>
               <w:t>X</w:t>
             </w:r>
@@ -2760,6 +2810,117 @@
                 <w:sz w:val="18"/>
                 <w:szCs w:val="18"/>
               </w:rPr>
+              <w:t>1</w:t>
+            </w:r>
+            <w:r>
+              <w:rPr>
+                <w:sz w:val="18"/>
+                <w:szCs w:val="18"/>
+              </w:rPr>
+              <w:t>7</w:t>
+            </w:r>
+            <w:r>
+              <w:rPr>
+                <w:sz w:val="18"/>
+                <w:szCs w:val="18"/>
+              </w:rPr>
+              <w:t>(1</w:t>
+            </w:r>
+            <w:r>
+              <w:rPr>
+                <w:sz w:val="18"/>
+                <w:szCs w:val="18"/>
+              </w:rPr>
+              <w:t>1</w:t>
+            </w:r>
+            <w:r>
+              <w:rPr>
+                <w:sz w:val="18"/>
+                <w:szCs w:val="18"/>
+              </w:rPr>
+              <w:t xml:space="preserve">) = </w:t>
+            </w:r>
+            <w:r>
+              <w:rPr>
+                <w:sz w:val="18"/>
+                <w:szCs w:val="18"/>
+              </w:rPr>
+              <w:t>CV Slew</w:t>
+            </w:r>
+          </w:p>
+        </w:tc>
+        <w:tc>
+          <w:tcPr>
+            <w:tcW w:w="1250" w:type="pct"/>
+          </w:tcPr>
+          <w:p>
+            <w:pPr>
+              <w:rPr>
+                <w:sz w:val="18"/>
+                <w:szCs w:val="18"/>
+              </w:rPr>
+            </w:pPr>
+            <w:r>
+              <w:rPr>
+                <w:sz w:val="18"/>
+                <w:szCs w:val="18"/>
+              </w:rPr>
+              <w:t>X</w:t>
+            </w:r>
+          </w:p>
+        </w:tc>
+        <w:tc>
+          <w:tcPr>
+            <w:tcW w:w="1250" w:type="pct"/>
+          </w:tcPr>
+          <w:p>
+            <w:pPr>
+              <w:rPr>
+                <w:sz w:val="18"/>
+                <w:szCs w:val="18"/>
+              </w:rPr>
+            </w:pPr>
+            <w:r>
+              <w:rPr>
+                <w:sz w:val="18"/>
+                <w:szCs w:val="18"/>
+              </w:rPr>
+              <w:t xml:space="preserve">Units of PP24 </w:t>
+            </w:r>
+          </w:p>
+        </w:tc>
+      </w:tr>
+      <w:tr>
+        <w:tc>
+          <w:tcPr>
+            <w:tcW w:w="1250" w:type="pct"/>
+            <w:vMerge/>
+          </w:tcPr>
+          <w:p>
+            <w:pPr>
+              <w:rPr>
+                <w:sz w:val="18"/>
+                <w:szCs w:val="18"/>
+              </w:rPr>
+            </w:pPr>
+          </w:p>
+        </w:tc>
+        <w:tc>
+          <w:tcPr>
+            <w:tcW w:w="1250" w:type="pct"/>
+          </w:tcPr>
+          <w:p>
+            <w:pPr>
+              <w:rPr>
+                <w:sz w:val="18"/>
+                <w:szCs w:val="18"/>
+              </w:rPr>
+            </w:pPr>
+            <w:r>
+              <w:rPr>
+                <w:sz w:val="18"/>
+                <w:szCs w:val="18"/>
+              </w:rPr>
               <w:t>98</w:t>
             </w:r>
             <w:r>
@@ -2814,15 +2975,7 @@
                 <w:sz w:val="18"/>
                 <w:szCs w:val="18"/>
               </w:rPr>
-              <w:t xml:space="preserve">Correction  (0-127) mapped to -63 to +63 DAC units </w:t>
-            </w:r>
-            <w:r>
-              <w:rPr>
-                <w:sz w:val="18"/>
-                <w:szCs w:val="18"/>
-              </w:rPr>
-              <w:lastRenderedPageBreak/>
-              <w:t>(2mV) over full 8 octave range</w:t>
+              <w:t>Correction  (0-127) mapped to -63 to +63 DAC units (2mV) over full 8 octave range</w:t>
             </w:r>
           </w:p>
         </w:tc>

</xml_diff>